<commit_message>
Add a global List/Grid layout toggle for browsing a large library
With ~50 shows, the full-detail row list means a lot of scrolling to
get through Watch Next, Yet to Start, and the rest. Adds a single
List/Grid toggle, applied universally (one preference, not per-page)
across Watch Next, both calendars, the You tab's full TV/movie lists,
and Lists — persisted across sessions.

Grid mode shows just the poster plus a one-line caption (next episode,
status, or countdown, reusing the same text each section's row layout
already computes) with no title text, since the poster alone is
usually enough to recognize a show. Row and grid modes share the same
caption-building logic per section so nothing had to be duplicated,
and the remove-from-list overlay button still works in grid tiles.

Updates the PRD's §6.4 entry to describe the toggle.

Co-Authored-By: Claude Sonnet 5 <noreply@anthropic.com>
</commit_message>
<xml_diff>
--- a/docs/TV-Time-2.0-PRD.docx
+++ b/docs/TV-Time-2.0-PRD.docx
@@ -715,12 +715,7 @@
         <w:spacing w:after="160"/>
       </w:pPr>
       <w:r>
-        <w:rPr>
-          <w:b w:val="0"/>
-          <w:i w:val="0"/>
-          <w:sz w:val="22"/>
-        </w:rPr>
-        <w:t>The library previews shows and movies with a one-tap “See all” into the full list, both ordered into three tiers: watching/watched first (most recently watched), then released-but-untouched (most recently added), then not yet released (soonest-releasing first). Stats summarize episodes watched, time spent, and completion counts, split by TV and movies.</w:t>
+        <w:t>The library previews shows and movies with a one-tap “See all” into the full list, both ordered into three tiers: watching/watched first (most recently watched), then released-but-untouched (most recently added), then not yet released (soonest-releasing first). A single global List/Grid toggle — remembered across sessions and applied everywhere a collection renders (Watch Next, calendars, full lists, and Lists) — switches between full-detail rows and a compact poster grid captioned with just the next episode or status, for browsing a large library with far less scrolling. Stats summarize episodes watched, time spent, and completion counts, split by TV and movies.</w:t>
       </w:r>
     </w:p>
     <w:p>

</xml_diff>